<commit_message>
adding onto company reasearch
</commit_message>
<xml_diff>
--- a/research/companies.docx
+++ b/research/companies.docx
@@ -247,6 +247,120 @@
         <w:t xml:space="preserve">?: Sanitation/ health products. Location: ? </w:t>
       </w:r>
     </w:p>
+    <w:p>
+      <w:r>
+        <w:t xml:space="preserve">Activision: Video Game publisher, </w:t>
+      </w:r>
+      <w:hyperlink r:id="rId5" w:history="1">
+        <w:r>
+          <w:rPr>
+            <w:rStyle w:val="Hyperlink"/>
+          </w:rPr>
+          <w:t>Eastpoint St, North Wall, Dublin</w:t>
+        </w:r>
+      </w:hyperlink>
+    </w:p>
+    <w:p>
+      <w:r>
+        <w:lastRenderedPageBreak/>
+        <w:t xml:space="preserve">Riot Games: Games development studio, </w:t>
+      </w:r>
+      <w:r>
+        <w:t>The Observatory, 7-11 Sir John Rogerson's Quay, Dublin, D02 VC42</w:t>
+      </w:r>
+    </w:p>
+    <w:p/>
+    <w:p>
+      <w:r>
+        <w:t>Riot Games:</w:t>
+      </w:r>
+    </w:p>
+    <w:p>
+      <w:r>
+        <w:t xml:space="preserve">Paid, easy to access, </w:t>
+      </w:r>
+      <w:r>
+        <w:t>mentorship, do program/ social events and courses.</w:t>
+      </w:r>
+    </w:p>
+    <w:p>
+      <w:r>
+        <w:t>According to website no current internships in Ireland</w:t>
+      </w:r>
+    </w:p>
+    <w:p/>
+    <w:p>
+      <w:r>
+        <w:t>Activision:</w:t>
+      </w:r>
+    </w:p>
+    <w:p>
+      <w:r>
+        <w:t>Harder to access</w:t>
+      </w:r>
+      <w:r>
+        <w:t>, Summer</w:t>
+      </w:r>
+    </w:p>
+    <w:p/>
+    <w:p>
+      <w:r>
+        <w:t>Amazon:</w:t>
+      </w:r>
+    </w:p>
+    <w:p>
+      <w:r>
+        <w:t xml:space="preserve">Hard to access, security specialist, </w:t>
+      </w:r>
+      <w:r>
+        <w:t>Security Specialist Intern, Data Centre Security</w:t>
+      </w:r>
+      <w:r>
+        <w:t xml:space="preserve">, </w:t>
+      </w:r>
+    </w:p>
+    <w:p>
+      <w:r>
+        <w:t>Responsibilities:</w:t>
+      </w:r>
+    </w:p>
+    <w:p>
+      <w:r>
+        <w:t>-Direct vendors</w:t>
+      </w:r>
+    </w:p>
+    <w:p>
+      <w:r>
+        <w:t>-extract information from hard data</w:t>
+      </w:r>
+    </w:p>
+    <w:p>
+      <w:r>
+        <w:t>-make suggestions to improve security</w:t>
+      </w:r>
+    </w:p>
+    <w:p>
+      <w:r>
+        <w:t>-help educate on false alarms</w:t>
+      </w:r>
+    </w:p>
+    <w:p/>
+    <w:p>
+      <w:r>
+        <w:t>IBM</w:t>
+      </w:r>
+    </w:p>
+    <w:p>
+      <w:r>
+        <w:t xml:space="preserve">Unknown, </w:t>
+      </w:r>
+      <w:r>
+        <w:t>treasury</w:t>
+      </w:r>
+    </w:p>
+    <w:p/>
+    <w:p/>
+    <w:p/>
     <w:p/>
     <w:p/>
     <w:sectPr>

</xml_diff>